<commit_message>
Give each week's lab a real writing area
The lab was a single caption-height line — too cramped to draft in. It's
now a block: LAB label on its own line, current text below it, then four
blank ruled lines, with wider interior padding. Roughly an inch of usable
space per week instead of one line.

All six paragraphs in a lab group carry byte-identical border and shading
definitions, which is what makes Word merge them into one continuous box
rather than six stacked ones. Verified in the XML: 72 shaded paragraphs
across 12 weeks, one distinct border variant.

LAB_BLANK_LINES at the top of the script tunes the height.

Co-Authored-By: Claude Fable 5 <noreply@anthropic.com>
</commit_message>
<xml_diff>
--- a/lab-planning/Pandaemonium-Architecture-6.0-Syllabus-Fall-2026.docx
+++ b/lab-planning/Pandaemonium-Architecture-6.0-Syllabus-Fall-2026.docx
@@ -506,13 +506,13 @@
     <w:p>
       <w:pPr>
         <w:pBdr>
-          <w:top w:val="single" w:color="BBBBBB" w:sz="2" w:space="6"/>
-          <w:bottom w:val="single" w:color="BBBBBB" w:sz="2" w:space="6"/>
-          <w:left w:val="single" w:color="BBBBBB" w:sz="2" w:space="6"/>
-          <w:right w:val="single" w:color="BBBBBB" w:sz="2" w:space="6"/>
-        </w:pBdr>
-        <w:shd w:fill="F2F2F2" w:color="auto" w:val="clear"/>
-        <w:spacing w:after="200" w:before="160" w:line="264"/>
+          <w:top w:val="single" w:color="BBBBBB" w:sz="2" w:space="10"/>
+          <w:bottom w:val="single" w:color="BBBBBB" w:sz="2" w:space="10"/>
+          <w:left w:val="single" w:color="BBBBBB" w:sz="2" w:space="12"/>
+          <w:right w:val="single" w:color="BBBBBB" w:sz="2" w:space="12"/>
+        </w:pBdr>
+        <w:shd w:fill="F2F2F2" w:color="auto" w:val="clear"/>
+        <w:spacing w:after="100" w:before="140" w:line="264"/>
       </w:pPr>
       <w:r>
         <w:rPr>
@@ -524,8 +524,20 @@
           <w:sz w:val="16"/>
           <w:szCs w:val="16"/>
         </w:rPr>
-        <w:t xml:space="preserve">LAB   </w:t>
-      </w:r>
+        <w:t xml:space="preserve">LAB</w:t>
+      </w:r>
+    </w:p>
+    <w:p>
+      <w:pPr>
+        <w:pBdr>
+          <w:top w:val="single" w:color="BBBBBB" w:sz="2" w:space="10"/>
+          <w:bottom w:val="single" w:color="BBBBBB" w:sz="2" w:space="10"/>
+          <w:left w:val="single" w:color="BBBBBB" w:sz="2" w:space="12"/>
+          <w:right w:val="single" w:color="BBBBBB" w:sz="2" w:space="12"/>
+        </w:pBdr>
+        <w:shd w:fill="F2F2F2" w:color="auto" w:val="clear"/>
+        <w:spacing w:after="120" w:line="300"/>
+      </w:pPr>
       <w:r>
         <w:rPr>
           <w:rFonts w:ascii="Georgia" w:cs="Georgia" w:eastAsia="Georgia" w:hAnsi="Georgia"/>
@@ -534,6 +546,86 @@
           <w:szCs w:val="21"/>
         </w:rPr>
         <w:t xml:space="preserve">TBD — generative/toy AI: Golly, Koan to Wotja, et al; latent diffusion models and transformers: “toy AIs” to LLMs, diffusion models, world models</w:t>
+      </w:r>
+    </w:p>
+    <w:p>
+      <w:pPr>
+        <w:pBdr>
+          <w:top w:val="single" w:color="BBBBBB" w:sz="2" w:space="10"/>
+          <w:bottom w:val="single" w:color="BBBBBB" w:sz="2" w:space="10"/>
+          <w:left w:val="single" w:color="BBBBBB" w:sz="2" w:space="12"/>
+          <w:right w:val="single" w:color="BBBBBB" w:sz="2" w:space="12"/>
+        </w:pBdr>
+        <w:shd w:fill="F2F2F2" w:color="auto" w:val="clear"/>
+        <w:spacing w:after="40" w:line="300"/>
+      </w:pPr>
+      <w:r>
+        <w:rPr>
+          <w:rFonts w:ascii="Georgia" w:cs="Georgia" w:eastAsia="Georgia" w:hAnsi="Georgia"/>
+          <w:sz w:val="21"/>
+          <w:szCs w:val="21"/>
+        </w:rPr>
+        <w:t xml:space="preserve"/>
+      </w:r>
+    </w:p>
+    <w:p>
+      <w:pPr>
+        <w:pBdr>
+          <w:top w:val="single" w:color="BBBBBB" w:sz="2" w:space="10"/>
+          <w:bottom w:val="single" w:color="BBBBBB" w:sz="2" w:space="10"/>
+          <w:left w:val="single" w:color="BBBBBB" w:sz="2" w:space="12"/>
+          <w:right w:val="single" w:color="BBBBBB" w:sz="2" w:space="12"/>
+        </w:pBdr>
+        <w:shd w:fill="F2F2F2" w:color="auto" w:val="clear"/>
+        <w:spacing w:after="40" w:line="300"/>
+      </w:pPr>
+      <w:r>
+        <w:rPr>
+          <w:rFonts w:ascii="Georgia" w:cs="Georgia" w:eastAsia="Georgia" w:hAnsi="Georgia"/>
+          <w:sz w:val="21"/>
+          <w:szCs w:val="21"/>
+        </w:rPr>
+        <w:t xml:space="preserve"/>
+      </w:r>
+    </w:p>
+    <w:p>
+      <w:pPr>
+        <w:pBdr>
+          <w:top w:val="single" w:color="BBBBBB" w:sz="2" w:space="10"/>
+          <w:bottom w:val="single" w:color="BBBBBB" w:sz="2" w:space="10"/>
+          <w:left w:val="single" w:color="BBBBBB" w:sz="2" w:space="12"/>
+          <w:right w:val="single" w:color="BBBBBB" w:sz="2" w:space="12"/>
+        </w:pBdr>
+        <w:shd w:fill="F2F2F2" w:color="auto" w:val="clear"/>
+        <w:spacing w:after="40" w:line="300"/>
+      </w:pPr>
+      <w:r>
+        <w:rPr>
+          <w:rFonts w:ascii="Georgia" w:cs="Georgia" w:eastAsia="Georgia" w:hAnsi="Georgia"/>
+          <w:sz w:val="21"/>
+          <w:szCs w:val="21"/>
+        </w:rPr>
+        <w:t xml:space="preserve"/>
+      </w:r>
+    </w:p>
+    <w:p>
+      <w:pPr>
+        <w:pBdr>
+          <w:top w:val="single" w:color="BBBBBB" w:sz="2" w:space="10"/>
+          <w:bottom w:val="single" w:color="BBBBBB" w:sz="2" w:space="10"/>
+          <w:left w:val="single" w:color="BBBBBB" w:sz="2" w:space="12"/>
+          <w:right w:val="single" w:color="BBBBBB" w:sz="2" w:space="12"/>
+        </w:pBdr>
+        <w:shd w:fill="F2F2F2" w:color="auto" w:val="clear"/>
+        <w:spacing w:after="160" w:line="300"/>
+      </w:pPr>
+      <w:r>
+        <w:rPr>
+          <w:rFonts w:ascii="Georgia" w:cs="Georgia" w:eastAsia="Georgia" w:hAnsi="Georgia"/>
+          <w:sz w:val="21"/>
+          <w:szCs w:val="21"/>
+        </w:rPr>
+        <w:t xml:space="preserve"/>
       </w:r>
     </w:p>
     <w:p>
@@ -882,13 +974,13 @@
     <w:p>
       <w:pPr>
         <w:pBdr>
-          <w:top w:val="single" w:color="BBBBBB" w:sz="2" w:space="6"/>
-          <w:bottom w:val="single" w:color="BBBBBB" w:sz="2" w:space="6"/>
-          <w:left w:val="single" w:color="BBBBBB" w:sz="2" w:space="6"/>
-          <w:right w:val="single" w:color="BBBBBB" w:sz="2" w:space="6"/>
-        </w:pBdr>
-        <w:shd w:fill="F2F2F2" w:color="auto" w:val="clear"/>
-        <w:spacing w:after="200" w:before="160" w:line="264"/>
+          <w:top w:val="single" w:color="BBBBBB" w:sz="2" w:space="10"/>
+          <w:bottom w:val="single" w:color="BBBBBB" w:sz="2" w:space="10"/>
+          <w:left w:val="single" w:color="BBBBBB" w:sz="2" w:space="12"/>
+          <w:right w:val="single" w:color="BBBBBB" w:sz="2" w:space="12"/>
+        </w:pBdr>
+        <w:shd w:fill="F2F2F2" w:color="auto" w:val="clear"/>
+        <w:spacing w:after="100" w:before="140" w:line="264"/>
       </w:pPr>
       <w:r>
         <w:rPr>
@@ -900,8 +992,20 @@
           <w:sz w:val="16"/>
           <w:szCs w:val="16"/>
         </w:rPr>
-        <w:t xml:space="preserve">LAB   </w:t>
-      </w:r>
+        <w:t xml:space="preserve">LAB</w:t>
+      </w:r>
+    </w:p>
+    <w:p>
+      <w:pPr>
+        <w:pBdr>
+          <w:top w:val="single" w:color="BBBBBB" w:sz="2" w:space="10"/>
+          <w:bottom w:val="single" w:color="BBBBBB" w:sz="2" w:space="10"/>
+          <w:left w:val="single" w:color="BBBBBB" w:sz="2" w:space="12"/>
+          <w:right w:val="single" w:color="BBBBBB" w:sz="2" w:space="12"/>
+        </w:pBdr>
+        <w:shd w:fill="F2F2F2" w:color="auto" w:val="clear"/>
+        <w:spacing w:after="120" w:line="300"/>
+      </w:pPr>
       <w:r>
         <w:rPr>
           <w:rFonts w:ascii="Georgia" w:cs="Georgia" w:eastAsia="Georgia" w:hAnsi="Georgia"/>
@@ -910,6 +1014,86 @@
           <w:szCs w:val="21"/>
         </w:rPr>
         <w:t xml:space="preserve">TBD — introduction to Claude, GitHub, Hugging Face, et al</w:t>
+      </w:r>
+    </w:p>
+    <w:p>
+      <w:pPr>
+        <w:pBdr>
+          <w:top w:val="single" w:color="BBBBBB" w:sz="2" w:space="10"/>
+          <w:bottom w:val="single" w:color="BBBBBB" w:sz="2" w:space="10"/>
+          <w:left w:val="single" w:color="BBBBBB" w:sz="2" w:space="12"/>
+          <w:right w:val="single" w:color="BBBBBB" w:sz="2" w:space="12"/>
+        </w:pBdr>
+        <w:shd w:fill="F2F2F2" w:color="auto" w:val="clear"/>
+        <w:spacing w:after="40" w:line="300"/>
+      </w:pPr>
+      <w:r>
+        <w:rPr>
+          <w:rFonts w:ascii="Georgia" w:cs="Georgia" w:eastAsia="Georgia" w:hAnsi="Georgia"/>
+          <w:sz w:val="21"/>
+          <w:szCs w:val="21"/>
+        </w:rPr>
+        <w:t xml:space="preserve"/>
+      </w:r>
+    </w:p>
+    <w:p>
+      <w:pPr>
+        <w:pBdr>
+          <w:top w:val="single" w:color="BBBBBB" w:sz="2" w:space="10"/>
+          <w:bottom w:val="single" w:color="BBBBBB" w:sz="2" w:space="10"/>
+          <w:left w:val="single" w:color="BBBBBB" w:sz="2" w:space="12"/>
+          <w:right w:val="single" w:color="BBBBBB" w:sz="2" w:space="12"/>
+        </w:pBdr>
+        <w:shd w:fill="F2F2F2" w:color="auto" w:val="clear"/>
+        <w:spacing w:after="40" w:line="300"/>
+      </w:pPr>
+      <w:r>
+        <w:rPr>
+          <w:rFonts w:ascii="Georgia" w:cs="Georgia" w:eastAsia="Georgia" w:hAnsi="Georgia"/>
+          <w:sz w:val="21"/>
+          <w:szCs w:val="21"/>
+        </w:rPr>
+        <w:t xml:space="preserve"/>
+      </w:r>
+    </w:p>
+    <w:p>
+      <w:pPr>
+        <w:pBdr>
+          <w:top w:val="single" w:color="BBBBBB" w:sz="2" w:space="10"/>
+          <w:bottom w:val="single" w:color="BBBBBB" w:sz="2" w:space="10"/>
+          <w:left w:val="single" w:color="BBBBBB" w:sz="2" w:space="12"/>
+          <w:right w:val="single" w:color="BBBBBB" w:sz="2" w:space="12"/>
+        </w:pBdr>
+        <w:shd w:fill="F2F2F2" w:color="auto" w:val="clear"/>
+        <w:spacing w:after="40" w:line="300"/>
+      </w:pPr>
+      <w:r>
+        <w:rPr>
+          <w:rFonts w:ascii="Georgia" w:cs="Georgia" w:eastAsia="Georgia" w:hAnsi="Georgia"/>
+          <w:sz w:val="21"/>
+          <w:szCs w:val="21"/>
+        </w:rPr>
+        <w:t xml:space="preserve"/>
+      </w:r>
+    </w:p>
+    <w:p>
+      <w:pPr>
+        <w:pBdr>
+          <w:top w:val="single" w:color="BBBBBB" w:sz="2" w:space="10"/>
+          <w:bottom w:val="single" w:color="BBBBBB" w:sz="2" w:space="10"/>
+          <w:left w:val="single" w:color="BBBBBB" w:sz="2" w:space="12"/>
+          <w:right w:val="single" w:color="BBBBBB" w:sz="2" w:space="12"/>
+        </w:pBdr>
+        <w:shd w:fill="F2F2F2" w:color="auto" w:val="clear"/>
+        <w:spacing w:after="160" w:line="300"/>
+      </w:pPr>
+      <w:r>
+        <w:rPr>
+          <w:rFonts w:ascii="Georgia" w:cs="Georgia" w:eastAsia="Georgia" w:hAnsi="Georgia"/>
+          <w:sz w:val="21"/>
+          <w:szCs w:val="21"/>
+        </w:rPr>
+        <w:t xml:space="preserve"/>
       </w:r>
     </w:p>
     <w:p>
@@ -1440,13 +1624,13 @@
     <w:p>
       <w:pPr>
         <w:pBdr>
-          <w:top w:val="single" w:color="BBBBBB" w:sz="2" w:space="6"/>
-          <w:bottom w:val="single" w:color="BBBBBB" w:sz="2" w:space="6"/>
-          <w:left w:val="single" w:color="BBBBBB" w:sz="2" w:space="6"/>
-          <w:right w:val="single" w:color="BBBBBB" w:sz="2" w:space="6"/>
-        </w:pBdr>
-        <w:shd w:fill="F2F2F2" w:color="auto" w:val="clear"/>
-        <w:spacing w:after="200" w:before="160" w:line="264"/>
+          <w:top w:val="single" w:color="BBBBBB" w:sz="2" w:space="10"/>
+          <w:bottom w:val="single" w:color="BBBBBB" w:sz="2" w:space="10"/>
+          <w:left w:val="single" w:color="BBBBBB" w:sz="2" w:space="12"/>
+          <w:right w:val="single" w:color="BBBBBB" w:sz="2" w:space="12"/>
+        </w:pBdr>
+        <w:shd w:fill="F2F2F2" w:color="auto" w:val="clear"/>
+        <w:spacing w:after="100" w:before="140" w:line="264"/>
       </w:pPr>
       <w:r>
         <w:rPr>
@@ -1458,8 +1642,20 @@
           <w:sz w:val="16"/>
           <w:szCs w:val="16"/>
         </w:rPr>
-        <w:t xml:space="preserve">LAB   </w:t>
-      </w:r>
+        <w:t xml:space="preserve">LAB</w:t>
+      </w:r>
+    </w:p>
+    <w:p>
+      <w:pPr>
+        <w:pBdr>
+          <w:top w:val="single" w:color="BBBBBB" w:sz="2" w:space="10"/>
+          <w:bottom w:val="single" w:color="BBBBBB" w:sz="2" w:space="10"/>
+          <w:left w:val="single" w:color="BBBBBB" w:sz="2" w:space="12"/>
+          <w:right w:val="single" w:color="BBBBBB" w:sz="2" w:space="12"/>
+        </w:pBdr>
+        <w:shd w:fill="F2F2F2" w:color="auto" w:val="clear"/>
+        <w:spacing w:after="120" w:line="300"/>
+      </w:pPr>
       <w:r>
         <w:rPr>
           <w:rFonts w:ascii="Georgia" w:cs="Georgia" w:eastAsia="Georgia" w:hAnsi="Georgia"/>
@@ -1468,6 +1664,86 @@
           <w:szCs w:val="21"/>
         </w:rPr>
         <w:t xml:space="preserve">TBD — LLMs, coding with LLMs</w:t>
+      </w:r>
+    </w:p>
+    <w:p>
+      <w:pPr>
+        <w:pBdr>
+          <w:top w:val="single" w:color="BBBBBB" w:sz="2" w:space="10"/>
+          <w:bottom w:val="single" w:color="BBBBBB" w:sz="2" w:space="10"/>
+          <w:left w:val="single" w:color="BBBBBB" w:sz="2" w:space="12"/>
+          <w:right w:val="single" w:color="BBBBBB" w:sz="2" w:space="12"/>
+        </w:pBdr>
+        <w:shd w:fill="F2F2F2" w:color="auto" w:val="clear"/>
+        <w:spacing w:after="40" w:line="300"/>
+      </w:pPr>
+      <w:r>
+        <w:rPr>
+          <w:rFonts w:ascii="Georgia" w:cs="Georgia" w:eastAsia="Georgia" w:hAnsi="Georgia"/>
+          <w:sz w:val="21"/>
+          <w:szCs w:val="21"/>
+        </w:rPr>
+        <w:t xml:space="preserve"/>
+      </w:r>
+    </w:p>
+    <w:p>
+      <w:pPr>
+        <w:pBdr>
+          <w:top w:val="single" w:color="BBBBBB" w:sz="2" w:space="10"/>
+          <w:bottom w:val="single" w:color="BBBBBB" w:sz="2" w:space="10"/>
+          <w:left w:val="single" w:color="BBBBBB" w:sz="2" w:space="12"/>
+          <w:right w:val="single" w:color="BBBBBB" w:sz="2" w:space="12"/>
+        </w:pBdr>
+        <w:shd w:fill="F2F2F2" w:color="auto" w:val="clear"/>
+        <w:spacing w:after="40" w:line="300"/>
+      </w:pPr>
+      <w:r>
+        <w:rPr>
+          <w:rFonts w:ascii="Georgia" w:cs="Georgia" w:eastAsia="Georgia" w:hAnsi="Georgia"/>
+          <w:sz w:val="21"/>
+          <w:szCs w:val="21"/>
+        </w:rPr>
+        <w:t xml:space="preserve"/>
+      </w:r>
+    </w:p>
+    <w:p>
+      <w:pPr>
+        <w:pBdr>
+          <w:top w:val="single" w:color="BBBBBB" w:sz="2" w:space="10"/>
+          <w:bottom w:val="single" w:color="BBBBBB" w:sz="2" w:space="10"/>
+          <w:left w:val="single" w:color="BBBBBB" w:sz="2" w:space="12"/>
+          <w:right w:val="single" w:color="BBBBBB" w:sz="2" w:space="12"/>
+        </w:pBdr>
+        <w:shd w:fill="F2F2F2" w:color="auto" w:val="clear"/>
+        <w:spacing w:after="40" w:line="300"/>
+      </w:pPr>
+      <w:r>
+        <w:rPr>
+          <w:rFonts w:ascii="Georgia" w:cs="Georgia" w:eastAsia="Georgia" w:hAnsi="Georgia"/>
+          <w:sz w:val="21"/>
+          <w:szCs w:val="21"/>
+        </w:rPr>
+        <w:t xml:space="preserve"/>
+      </w:r>
+    </w:p>
+    <w:p>
+      <w:pPr>
+        <w:pBdr>
+          <w:top w:val="single" w:color="BBBBBB" w:sz="2" w:space="10"/>
+          <w:bottom w:val="single" w:color="BBBBBB" w:sz="2" w:space="10"/>
+          <w:left w:val="single" w:color="BBBBBB" w:sz="2" w:space="12"/>
+          <w:right w:val="single" w:color="BBBBBB" w:sz="2" w:space="12"/>
+        </w:pBdr>
+        <w:shd w:fill="F2F2F2" w:color="auto" w:val="clear"/>
+        <w:spacing w:after="160" w:line="300"/>
+      </w:pPr>
+      <w:r>
+        <w:rPr>
+          <w:rFonts w:ascii="Georgia" w:cs="Georgia" w:eastAsia="Georgia" w:hAnsi="Georgia"/>
+          <w:sz w:val="21"/>
+          <w:szCs w:val="21"/>
+        </w:rPr>
+        <w:t xml:space="preserve"/>
       </w:r>
     </w:p>
     <w:p>
@@ -1868,13 +2144,13 @@
     <w:p>
       <w:pPr>
         <w:pBdr>
-          <w:top w:val="single" w:color="BBBBBB" w:sz="2" w:space="6"/>
-          <w:bottom w:val="single" w:color="BBBBBB" w:sz="2" w:space="6"/>
-          <w:left w:val="single" w:color="BBBBBB" w:sz="2" w:space="6"/>
-          <w:right w:val="single" w:color="BBBBBB" w:sz="2" w:space="6"/>
-        </w:pBdr>
-        <w:shd w:fill="F2F2F2" w:color="auto" w:val="clear"/>
-        <w:spacing w:after="200" w:before="160" w:line="264"/>
+          <w:top w:val="single" w:color="BBBBBB" w:sz="2" w:space="10"/>
+          <w:bottom w:val="single" w:color="BBBBBB" w:sz="2" w:space="10"/>
+          <w:left w:val="single" w:color="BBBBBB" w:sz="2" w:space="12"/>
+          <w:right w:val="single" w:color="BBBBBB" w:sz="2" w:space="12"/>
+        </w:pBdr>
+        <w:shd w:fill="F2F2F2" w:color="auto" w:val="clear"/>
+        <w:spacing w:after="100" w:before="140" w:line="264"/>
       </w:pPr>
       <w:r>
         <w:rPr>
@@ -1886,8 +2162,20 @@
           <w:sz w:val="16"/>
           <w:szCs w:val="16"/>
         </w:rPr>
-        <w:t xml:space="preserve">LAB   </w:t>
-      </w:r>
+        <w:t xml:space="preserve">LAB</w:t>
+      </w:r>
+    </w:p>
+    <w:p>
+      <w:pPr>
+        <w:pBdr>
+          <w:top w:val="single" w:color="BBBBBB" w:sz="2" w:space="10"/>
+          <w:bottom w:val="single" w:color="BBBBBB" w:sz="2" w:space="10"/>
+          <w:left w:val="single" w:color="BBBBBB" w:sz="2" w:space="12"/>
+          <w:right w:val="single" w:color="BBBBBB" w:sz="2" w:space="12"/>
+        </w:pBdr>
+        <w:shd w:fill="F2F2F2" w:color="auto" w:val="clear"/>
+        <w:spacing w:after="120" w:line="300"/>
+      </w:pPr>
       <w:r>
         <w:rPr>
           <w:rFonts w:ascii="Georgia" w:cs="Georgia" w:eastAsia="Georgia" w:hAnsi="Georgia"/>
@@ -1896,6 +2184,86 @@
           <w:szCs w:val="21"/>
         </w:rPr>
         <w:t xml:space="preserve">TBD</w:t>
+      </w:r>
+    </w:p>
+    <w:p>
+      <w:pPr>
+        <w:pBdr>
+          <w:top w:val="single" w:color="BBBBBB" w:sz="2" w:space="10"/>
+          <w:bottom w:val="single" w:color="BBBBBB" w:sz="2" w:space="10"/>
+          <w:left w:val="single" w:color="BBBBBB" w:sz="2" w:space="12"/>
+          <w:right w:val="single" w:color="BBBBBB" w:sz="2" w:space="12"/>
+        </w:pBdr>
+        <w:shd w:fill="F2F2F2" w:color="auto" w:val="clear"/>
+        <w:spacing w:after="40" w:line="300"/>
+      </w:pPr>
+      <w:r>
+        <w:rPr>
+          <w:rFonts w:ascii="Georgia" w:cs="Georgia" w:eastAsia="Georgia" w:hAnsi="Georgia"/>
+          <w:sz w:val="21"/>
+          <w:szCs w:val="21"/>
+        </w:rPr>
+        <w:t xml:space="preserve"/>
+      </w:r>
+    </w:p>
+    <w:p>
+      <w:pPr>
+        <w:pBdr>
+          <w:top w:val="single" w:color="BBBBBB" w:sz="2" w:space="10"/>
+          <w:bottom w:val="single" w:color="BBBBBB" w:sz="2" w:space="10"/>
+          <w:left w:val="single" w:color="BBBBBB" w:sz="2" w:space="12"/>
+          <w:right w:val="single" w:color="BBBBBB" w:sz="2" w:space="12"/>
+        </w:pBdr>
+        <w:shd w:fill="F2F2F2" w:color="auto" w:val="clear"/>
+        <w:spacing w:after="40" w:line="300"/>
+      </w:pPr>
+      <w:r>
+        <w:rPr>
+          <w:rFonts w:ascii="Georgia" w:cs="Georgia" w:eastAsia="Georgia" w:hAnsi="Georgia"/>
+          <w:sz w:val="21"/>
+          <w:szCs w:val="21"/>
+        </w:rPr>
+        <w:t xml:space="preserve"/>
+      </w:r>
+    </w:p>
+    <w:p>
+      <w:pPr>
+        <w:pBdr>
+          <w:top w:val="single" w:color="BBBBBB" w:sz="2" w:space="10"/>
+          <w:bottom w:val="single" w:color="BBBBBB" w:sz="2" w:space="10"/>
+          <w:left w:val="single" w:color="BBBBBB" w:sz="2" w:space="12"/>
+          <w:right w:val="single" w:color="BBBBBB" w:sz="2" w:space="12"/>
+        </w:pBdr>
+        <w:shd w:fill="F2F2F2" w:color="auto" w:val="clear"/>
+        <w:spacing w:after="40" w:line="300"/>
+      </w:pPr>
+      <w:r>
+        <w:rPr>
+          <w:rFonts w:ascii="Georgia" w:cs="Georgia" w:eastAsia="Georgia" w:hAnsi="Georgia"/>
+          <w:sz w:val="21"/>
+          <w:szCs w:val="21"/>
+        </w:rPr>
+        <w:t xml:space="preserve"/>
+      </w:r>
+    </w:p>
+    <w:p>
+      <w:pPr>
+        <w:pBdr>
+          <w:top w:val="single" w:color="BBBBBB" w:sz="2" w:space="10"/>
+          <w:bottom w:val="single" w:color="BBBBBB" w:sz="2" w:space="10"/>
+          <w:left w:val="single" w:color="BBBBBB" w:sz="2" w:space="12"/>
+          <w:right w:val="single" w:color="BBBBBB" w:sz="2" w:space="12"/>
+        </w:pBdr>
+        <w:shd w:fill="F2F2F2" w:color="auto" w:val="clear"/>
+        <w:spacing w:after="160" w:line="300"/>
+      </w:pPr>
+      <w:r>
+        <w:rPr>
+          <w:rFonts w:ascii="Georgia" w:cs="Georgia" w:eastAsia="Georgia" w:hAnsi="Georgia"/>
+          <w:sz w:val="21"/>
+          <w:szCs w:val="21"/>
+        </w:rPr>
+        <w:t xml:space="preserve"/>
       </w:r>
     </w:p>
     <w:p>
@@ -2182,13 +2550,13 @@
     <w:p>
       <w:pPr>
         <w:pBdr>
-          <w:top w:val="single" w:color="BBBBBB" w:sz="2" w:space="6"/>
-          <w:bottom w:val="single" w:color="BBBBBB" w:sz="2" w:space="6"/>
-          <w:left w:val="single" w:color="BBBBBB" w:sz="2" w:space="6"/>
-          <w:right w:val="single" w:color="BBBBBB" w:sz="2" w:space="6"/>
-        </w:pBdr>
-        <w:shd w:fill="F2F2F2" w:color="auto" w:val="clear"/>
-        <w:spacing w:after="200" w:before="160" w:line="264"/>
+          <w:top w:val="single" w:color="BBBBBB" w:sz="2" w:space="10"/>
+          <w:bottom w:val="single" w:color="BBBBBB" w:sz="2" w:space="10"/>
+          <w:left w:val="single" w:color="BBBBBB" w:sz="2" w:space="12"/>
+          <w:right w:val="single" w:color="BBBBBB" w:sz="2" w:space="12"/>
+        </w:pBdr>
+        <w:shd w:fill="F2F2F2" w:color="auto" w:val="clear"/>
+        <w:spacing w:after="100" w:before="140" w:line="264"/>
       </w:pPr>
       <w:r>
         <w:rPr>
@@ -2200,8 +2568,20 @@
           <w:sz w:val="16"/>
           <w:szCs w:val="16"/>
         </w:rPr>
-        <w:t xml:space="preserve">LAB   </w:t>
-      </w:r>
+        <w:t xml:space="preserve">LAB</w:t>
+      </w:r>
+    </w:p>
+    <w:p>
+      <w:pPr>
+        <w:pBdr>
+          <w:top w:val="single" w:color="BBBBBB" w:sz="2" w:space="10"/>
+          <w:bottom w:val="single" w:color="BBBBBB" w:sz="2" w:space="10"/>
+          <w:left w:val="single" w:color="BBBBBB" w:sz="2" w:space="12"/>
+          <w:right w:val="single" w:color="BBBBBB" w:sz="2" w:space="12"/>
+        </w:pBdr>
+        <w:shd w:fill="F2F2F2" w:color="auto" w:val="clear"/>
+        <w:spacing w:after="120" w:line="300"/>
+      </w:pPr>
       <w:r>
         <w:rPr>
           <w:rFonts w:ascii="Georgia" w:cs="Georgia" w:eastAsia="Georgia" w:hAnsi="Georgia"/>
@@ -2210,6 +2590,86 @@
           <w:szCs w:val="21"/>
         </w:rPr>
         <w:t xml:space="preserve">TBD</w:t>
+      </w:r>
+    </w:p>
+    <w:p>
+      <w:pPr>
+        <w:pBdr>
+          <w:top w:val="single" w:color="BBBBBB" w:sz="2" w:space="10"/>
+          <w:bottom w:val="single" w:color="BBBBBB" w:sz="2" w:space="10"/>
+          <w:left w:val="single" w:color="BBBBBB" w:sz="2" w:space="12"/>
+          <w:right w:val="single" w:color="BBBBBB" w:sz="2" w:space="12"/>
+        </w:pBdr>
+        <w:shd w:fill="F2F2F2" w:color="auto" w:val="clear"/>
+        <w:spacing w:after="40" w:line="300"/>
+      </w:pPr>
+      <w:r>
+        <w:rPr>
+          <w:rFonts w:ascii="Georgia" w:cs="Georgia" w:eastAsia="Georgia" w:hAnsi="Georgia"/>
+          <w:sz w:val="21"/>
+          <w:szCs w:val="21"/>
+        </w:rPr>
+        <w:t xml:space="preserve"/>
+      </w:r>
+    </w:p>
+    <w:p>
+      <w:pPr>
+        <w:pBdr>
+          <w:top w:val="single" w:color="BBBBBB" w:sz="2" w:space="10"/>
+          <w:bottom w:val="single" w:color="BBBBBB" w:sz="2" w:space="10"/>
+          <w:left w:val="single" w:color="BBBBBB" w:sz="2" w:space="12"/>
+          <w:right w:val="single" w:color="BBBBBB" w:sz="2" w:space="12"/>
+        </w:pBdr>
+        <w:shd w:fill="F2F2F2" w:color="auto" w:val="clear"/>
+        <w:spacing w:after="40" w:line="300"/>
+      </w:pPr>
+      <w:r>
+        <w:rPr>
+          <w:rFonts w:ascii="Georgia" w:cs="Georgia" w:eastAsia="Georgia" w:hAnsi="Georgia"/>
+          <w:sz w:val="21"/>
+          <w:szCs w:val="21"/>
+        </w:rPr>
+        <w:t xml:space="preserve"/>
+      </w:r>
+    </w:p>
+    <w:p>
+      <w:pPr>
+        <w:pBdr>
+          <w:top w:val="single" w:color="BBBBBB" w:sz="2" w:space="10"/>
+          <w:bottom w:val="single" w:color="BBBBBB" w:sz="2" w:space="10"/>
+          <w:left w:val="single" w:color="BBBBBB" w:sz="2" w:space="12"/>
+          <w:right w:val="single" w:color="BBBBBB" w:sz="2" w:space="12"/>
+        </w:pBdr>
+        <w:shd w:fill="F2F2F2" w:color="auto" w:val="clear"/>
+        <w:spacing w:after="40" w:line="300"/>
+      </w:pPr>
+      <w:r>
+        <w:rPr>
+          <w:rFonts w:ascii="Georgia" w:cs="Georgia" w:eastAsia="Georgia" w:hAnsi="Georgia"/>
+          <w:sz w:val="21"/>
+          <w:szCs w:val="21"/>
+        </w:rPr>
+        <w:t xml:space="preserve"/>
+      </w:r>
+    </w:p>
+    <w:p>
+      <w:pPr>
+        <w:pBdr>
+          <w:top w:val="single" w:color="BBBBBB" w:sz="2" w:space="10"/>
+          <w:bottom w:val="single" w:color="BBBBBB" w:sz="2" w:space="10"/>
+          <w:left w:val="single" w:color="BBBBBB" w:sz="2" w:space="12"/>
+          <w:right w:val="single" w:color="BBBBBB" w:sz="2" w:space="12"/>
+        </w:pBdr>
+        <w:shd w:fill="F2F2F2" w:color="auto" w:val="clear"/>
+        <w:spacing w:after="160" w:line="300"/>
+      </w:pPr>
+      <w:r>
+        <w:rPr>
+          <w:rFonts w:ascii="Georgia" w:cs="Georgia" w:eastAsia="Georgia" w:hAnsi="Georgia"/>
+          <w:sz w:val="21"/>
+          <w:szCs w:val="21"/>
+        </w:rPr>
+        <w:t xml:space="preserve"/>
       </w:r>
     </w:p>
     <w:p>
@@ -2282,13 +2742,13 @@
     <w:p>
       <w:pPr>
         <w:pBdr>
-          <w:top w:val="single" w:color="BBBBBB" w:sz="2" w:space="6"/>
-          <w:bottom w:val="single" w:color="BBBBBB" w:sz="2" w:space="6"/>
-          <w:left w:val="single" w:color="BBBBBB" w:sz="2" w:space="6"/>
-          <w:right w:val="single" w:color="BBBBBB" w:sz="2" w:space="6"/>
-        </w:pBdr>
-        <w:shd w:fill="F2F2F2" w:color="auto" w:val="clear"/>
-        <w:spacing w:after="200" w:before="160" w:line="264"/>
+          <w:top w:val="single" w:color="BBBBBB" w:sz="2" w:space="10"/>
+          <w:bottom w:val="single" w:color="BBBBBB" w:sz="2" w:space="10"/>
+          <w:left w:val="single" w:color="BBBBBB" w:sz="2" w:space="12"/>
+          <w:right w:val="single" w:color="BBBBBB" w:sz="2" w:space="12"/>
+        </w:pBdr>
+        <w:shd w:fill="F2F2F2" w:color="auto" w:val="clear"/>
+        <w:spacing w:after="100" w:before="140" w:line="264"/>
       </w:pPr>
       <w:r>
         <w:rPr>
@@ -2300,8 +2760,20 @@
           <w:sz w:val="16"/>
           <w:szCs w:val="16"/>
         </w:rPr>
-        <w:t xml:space="preserve">LAB   </w:t>
-      </w:r>
+        <w:t xml:space="preserve">LAB</w:t>
+      </w:r>
+    </w:p>
+    <w:p>
+      <w:pPr>
+        <w:pBdr>
+          <w:top w:val="single" w:color="BBBBBB" w:sz="2" w:space="10"/>
+          <w:bottom w:val="single" w:color="BBBBBB" w:sz="2" w:space="10"/>
+          <w:left w:val="single" w:color="BBBBBB" w:sz="2" w:space="12"/>
+          <w:right w:val="single" w:color="BBBBBB" w:sz="2" w:space="12"/>
+        </w:pBdr>
+        <w:shd w:fill="F2F2F2" w:color="auto" w:val="clear"/>
+        <w:spacing w:after="120" w:line="300"/>
+      </w:pPr>
       <w:r>
         <w:rPr>
           <w:rFonts w:ascii="Georgia" w:cs="Georgia" w:eastAsia="Georgia" w:hAnsi="Georgia"/>
@@ -2310,6 +2782,86 @@
           <w:szCs w:val="21"/>
         </w:rPr>
         <w:t xml:space="preserve">TBD</w:t>
+      </w:r>
+    </w:p>
+    <w:p>
+      <w:pPr>
+        <w:pBdr>
+          <w:top w:val="single" w:color="BBBBBB" w:sz="2" w:space="10"/>
+          <w:bottom w:val="single" w:color="BBBBBB" w:sz="2" w:space="10"/>
+          <w:left w:val="single" w:color="BBBBBB" w:sz="2" w:space="12"/>
+          <w:right w:val="single" w:color="BBBBBB" w:sz="2" w:space="12"/>
+        </w:pBdr>
+        <w:shd w:fill="F2F2F2" w:color="auto" w:val="clear"/>
+        <w:spacing w:after="40" w:line="300"/>
+      </w:pPr>
+      <w:r>
+        <w:rPr>
+          <w:rFonts w:ascii="Georgia" w:cs="Georgia" w:eastAsia="Georgia" w:hAnsi="Georgia"/>
+          <w:sz w:val="21"/>
+          <w:szCs w:val="21"/>
+        </w:rPr>
+        <w:t xml:space="preserve"/>
+      </w:r>
+    </w:p>
+    <w:p>
+      <w:pPr>
+        <w:pBdr>
+          <w:top w:val="single" w:color="BBBBBB" w:sz="2" w:space="10"/>
+          <w:bottom w:val="single" w:color="BBBBBB" w:sz="2" w:space="10"/>
+          <w:left w:val="single" w:color="BBBBBB" w:sz="2" w:space="12"/>
+          <w:right w:val="single" w:color="BBBBBB" w:sz="2" w:space="12"/>
+        </w:pBdr>
+        <w:shd w:fill="F2F2F2" w:color="auto" w:val="clear"/>
+        <w:spacing w:after="40" w:line="300"/>
+      </w:pPr>
+      <w:r>
+        <w:rPr>
+          <w:rFonts w:ascii="Georgia" w:cs="Georgia" w:eastAsia="Georgia" w:hAnsi="Georgia"/>
+          <w:sz w:val="21"/>
+          <w:szCs w:val="21"/>
+        </w:rPr>
+        <w:t xml:space="preserve"/>
+      </w:r>
+    </w:p>
+    <w:p>
+      <w:pPr>
+        <w:pBdr>
+          <w:top w:val="single" w:color="BBBBBB" w:sz="2" w:space="10"/>
+          <w:bottom w:val="single" w:color="BBBBBB" w:sz="2" w:space="10"/>
+          <w:left w:val="single" w:color="BBBBBB" w:sz="2" w:space="12"/>
+          <w:right w:val="single" w:color="BBBBBB" w:sz="2" w:space="12"/>
+        </w:pBdr>
+        <w:shd w:fill="F2F2F2" w:color="auto" w:val="clear"/>
+        <w:spacing w:after="40" w:line="300"/>
+      </w:pPr>
+      <w:r>
+        <w:rPr>
+          <w:rFonts w:ascii="Georgia" w:cs="Georgia" w:eastAsia="Georgia" w:hAnsi="Georgia"/>
+          <w:sz w:val="21"/>
+          <w:szCs w:val="21"/>
+        </w:rPr>
+        <w:t xml:space="preserve"/>
+      </w:r>
+    </w:p>
+    <w:p>
+      <w:pPr>
+        <w:pBdr>
+          <w:top w:val="single" w:color="BBBBBB" w:sz="2" w:space="10"/>
+          <w:bottom w:val="single" w:color="BBBBBB" w:sz="2" w:space="10"/>
+          <w:left w:val="single" w:color="BBBBBB" w:sz="2" w:space="12"/>
+          <w:right w:val="single" w:color="BBBBBB" w:sz="2" w:space="12"/>
+        </w:pBdr>
+        <w:shd w:fill="F2F2F2" w:color="auto" w:val="clear"/>
+        <w:spacing w:after="160" w:line="300"/>
+      </w:pPr>
+      <w:r>
+        <w:rPr>
+          <w:rFonts w:ascii="Georgia" w:cs="Georgia" w:eastAsia="Georgia" w:hAnsi="Georgia"/>
+          <w:sz w:val="21"/>
+          <w:szCs w:val="21"/>
+        </w:rPr>
+        <w:t xml:space="preserve"/>
       </w:r>
     </w:p>
     <w:p>
@@ -2606,13 +3158,13 @@
     <w:p>
       <w:pPr>
         <w:pBdr>
-          <w:top w:val="single" w:color="BBBBBB" w:sz="2" w:space="6"/>
-          <w:bottom w:val="single" w:color="BBBBBB" w:sz="2" w:space="6"/>
-          <w:left w:val="single" w:color="BBBBBB" w:sz="2" w:space="6"/>
-          <w:right w:val="single" w:color="BBBBBB" w:sz="2" w:space="6"/>
-        </w:pBdr>
-        <w:shd w:fill="F2F2F2" w:color="auto" w:val="clear"/>
-        <w:spacing w:after="200" w:before="160" w:line="264"/>
+          <w:top w:val="single" w:color="BBBBBB" w:sz="2" w:space="10"/>
+          <w:bottom w:val="single" w:color="BBBBBB" w:sz="2" w:space="10"/>
+          <w:left w:val="single" w:color="BBBBBB" w:sz="2" w:space="12"/>
+          <w:right w:val="single" w:color="BBBBBB" w:sz="2" w:space="12"/>
+        </w:pBdr>
+        <w:shd w:fill="F2F2F2" w:color="auto" w:val="clear"/>
+        <w:spacing w:after="100" w:before="140" w:line="264"/>
       </w:pPr>
       <w:r>
         <w:rPr>
@@ -2624,8 +3176,20 @@
           <w:sz w:val="16"/>
           <w:szCs w:val="16"/>
         </w:rPr>
-        <w:t xml:space="preserve">LAB   </w:t>
-      </w:r>
+        <w:t xml:space="preserve">LAB</w:t>
+      </w:r>
+    </w:p>
+    <w:p>
+      <w:pPr>
+        <w:pBdr>
+          <w:top w:val="single" w:color="BBBBBB" w:sz="2" w:space="10"/>
+          <w:bottom w:val="single" w:color="BBBBBB" w:sz="2" w:space="10"/>
+          <w:left w:val="single" w:color="BBBBBB" w:sz="2" w:space="12"/>
+          <w:right w:val="single" w:color="BBBBBB" w:sz="2" w:space="12"/>
+        </w:pBdr>
+        <w:shd w:fill="F2F2F2" w:color="auto" w:val="clear"/>
+        <w:spacing w:after="120" w:line="300"/>
+      </w:pPr>
       <w:r>
         <w:rPr>
           <w:rFonts w:ascii="Georgia" w:cs="Georgia" w:eastAsia="Georgia" w:hAnsi="Georgia"/>
@@ -2634,6 +3198,86 @@
           <w:szCs w:val="21"/>
         </w:rPr>
         <w:t xml:space="preserve">Multi-dimensional data, t-SNE, word clouds</w:t>
+      </w:r>
+    </w:p>
+    <w:p>
+      <w:pPr>
+        <w:pBdr>
+          <w:top w:val="single" w:color="BBBBBB" w:sz="2" w:space="10"/>
+          <w:bottom w:val="single" w:color="BBBBBB" w:sz="2" w:space="10"/>
+          <w:left w:val="single" w:color="BBBBBB" w:sz="2" w:space="12"/>
+          <w:right w:val="single" w:color="BBBBBB" w:sz="2" w:space="12"/>
+        </w:pBdr>
+        <w:shd w:fill="F2F2F2" w:color="auto" w:val="clear"/>
+        <w:spacing w:after="40" w:line="300"/>
+      </w:pPr>
+      <w:r>
+        <w:rPr>
+          <w:rFonts w:ascii="Georgia" w:cs="Georgia" w:eastAsia="Georgia" w:hAnsi="Georgia"/>
+          <w:sz w:val="21"/>
+          <w:szCs w:val="21"/>
+        </w:rPr>
+        <w:t xml:space="preserve"/>
+      </w:r>
+    </w:p>
+    <w:p>
+      <w:pPr>
+        <w:pBdr>
+          <w:top w:val="single" w:color="BBBBBB" w:sz="2" w:space="10"/>
+          <w:bottom w:val="single" w:color="BBBBBB" w:sz="2" w:space="10"/>
+          <w:left w:val="single" w:color="BBBBBB" w:sz="2" w:space="12"/>
+          <w:right w:val="single" w:color="BBBBBB" w:sz="2" w:space="12"/>
+        </w:pBdr>
+        <w:shd w:fill="F2F2F2" w:color="auto" w:val="clear"/>
+        <w:spacing w:after="40" w:line="300"/>
+      </w:pPr>
+      <w:r>
+        <w:rPr>
+          <w:rFonts w:ascii="Georgia" w:cs="Georgia" w:eastAsia="Georgia" w:hAnsi="Georgia"/>
+          <w:sz w:val="21"/>
+          <w:szCs w:val="21"/>
+        </w:rPr>
+        <w:t xml:space="preserve"/>
+      </w:r>
+    </w:p>
+    <w:p>
+      <w:pPr>
+        <w:pBdr>
+          <w:top w:val="single" w:color="BBBBBB" w:sz="2" w:space="10"/>
+          <w:bottom w:val="single" w:color="BBBBBB" w:sz="2" w:space="10"/>
+          <w:left w:val="single" w:color="BBBBBB" w:sz="2" w:space="12"/>
+          <w:right w:val="single" w:color="BBBBBB" w:sz="2" w:space="12"/>
+        </w:pBdr>
+        <w:shd w:fill="F2F2F2" w:color="auto" w:val="clear"/>
+        <w:spacing w:after="40" w:line="300"/>
+      </w:pPr>
+      <w:r>
+        <w:rPr>
+          <w:rFonts w:ascii="Georgia" w:cs="Georgia" w:eastAsia="Georgia" w:hAnsi="Georgia"/>
+          <w:sz w:val="21"/>
+          <w:szCs w:val="21"/>
+        </w:rPr>
+        <w:t xml:space="preserve"/>
+      </w:r>
+    </w:p>
+    <w:p>
+      <w:pPr>
+        <w:pBdr>
+          <w:top w:val="single" w:color="BBBBBB" w:sz="2" w:space="10"/>
+          <w:bottom w:val="single" w:color="BBBBBB" w:sz="2" w:space="10"/>
+          <w:left w:val="single" w:color="BBBBBB" w:sz="2" w:space="12"/>
+          <w:right w:val="single" w:color="BBBBBB" w:sz="2" w:space="12"/>
+        </w:pBdr>
+        <w:shd w:fill="F2F2F2" w:color="auto" w:val="clear"/>
+        <w:spacing w:after="160" w:line="300"/>
+      </w:pPr>
+      <w:r>
+        <w:rPr>
+          <w:rFonts w:ascii="Georgia" w:cs="Georgia" w:eastAsia="Georgia" w:hAnsi="Georgia"/>
+          <w:sz w:val="21"/>
+          <w:szCs w:val="21"/>
+        </w:rPr>
+        <w:t xml:space="preserve"/>
       </w:r>
     </w:p>
     <w:p>
@@ -2878,13 +3522,13 @@
     <w:p>
       <w:pPr>
         <w:pBdr>
-          <w:top w:val="single" w:color="BBBBBB" w:sz="2" w:space="6"/>
-          <w:bottom w:val="single" w:color="BBBBBB" w:sz="2" w:space="6"/>
-          <w:left w:val="single" w:color="BBBBBB" w:sz="2" w:space="6"/>
-          <w:right w:val="single" w:color="BBBBBB" w:sz="2" w:space="6"/>
-        </w:pBdr>
-        <w:shd w:fill="F2F2F2" w:color="auto" w:val="clear"/>
-        <w:spacing w:after="200" w:before="160" w:line="264"/>
+          <w:top w:val="single" w:color="BBBBBB" w:sz="2" w:space="10"/>
+          <w:bottom w:val="single" w:color="BBBBBB" w:sz="2" w:space="10"/>
+          <w:left w:val="single" w:color="BBBBBB" w:sz="2" w:space="12"/>
+          <w:right w:val="single" w:color="BBBBBB" w:sz="2" w:space="12"/>
+        </w:pBdr>
+        <w:shd w:fill="F2F2F2" w:color="auto" w:val="clear"/>
+        <w:spacing w:after="100" w:before="140" w:line="264"/>
       </w:pPr>
       <w:r>
         <w:rPr>
@@ -2896,8 +3540,20 @@
           <w:sz w:val="16"/>
           <w:szCs w:val="16"/>
         </w:rPr>
-        <w:t xml:space="preserve">LAB   </w:t>
-      </w:r>
+        <w:t xml:space="preserve">LAB</w:t>
+      </w:r>
+    </w:p>
+    <w:p>
+      <w:pPr>
+        <w:pBdr>
+          <w:top w:val="single" w:color="BBBBBB" w:sz="2" w:space="10"/>
+          <w:bottom w:val="single" w:color="BBBBBB" w:sz="2" w:space="10"/>
+          <w:left w:val="single" w:color="BBBBBB" w:sz="2" w:space="12"/>
+          <w:right w:val="single" w:color="BBBBBB" w:sz="2" w:space="12"/>
+        </w:pBdr>
+        <w:shd w:fill="F2F2F2" w:color="auto" w:val="clear"/>
+        <w:spacing w:after="120" w:line="300"/>
+      </w:pPr>
       <w:r>
         <w:rPr>
           <w:rFonts w:ascii="Georgia" w:cs="Georgia" w:eastAsia="Georgia" w:hAnsi="Georgia"/>
@@ -2906,6 +3562,86 @@
           <w:szCs w:val="21"/>
         </w:rPr>
         <w:t xml:space="preserve">TBD</w:t>
+      </w:r>
+    </w:p>
+    <w:p>
+      <w:pPr>
+        <w:pBdr>
+          <w:top w:val="single" w:color="BBBBBB" w:sz="2" w:space="10"/>
+          <w:bottom w:val="single" w:color="BBBBBB" w:sz="2" w:space="10"/>
+          <w:left w:val="single" w:color="BBBBBB" w:sz="2" w:space="12"/>
+          <w:right w:val="single" w:color="BBBBBB" w:sz="2" w:space="12"/>
+        </w:pBdr>
+        <w:shd w:fill="F2F2F2" w:color="auto" w:val="clear"/>
+        <w:spacing w:after="40" w:line="300"/>
+      </w:pPr>
+      <w:r>
+        <w:rPr>
+          <w:rFonts w:ascii="Georgia" w:cs="Georgia" w:eastAsia="Georgia" w:hAnsi="Georgia"/>
+          <w:sz w:val="21"/>
+          <w:szCs w:val="21"/>
+        </w:rPr>
+        <w:t xml:space="preserve"/>
+      </w:r>
+    </w:p>
+    <w:p>
+      <w:pPr>
+        <w:pBdr>
+          <w:top w:val="single" w:color="BBBBBB" w:sz="2" w:space="10"/>
+          <w:bottom w:val="single" w:color="BBBBBB" w:sz="2" w:space="10"/>
+          <w:left w:val="single" w:color="BBBBBB" w:sz="2" w:space="12"/>
+          <w:right w:val="single" w:color="BBBBBB" w:sz="2" w:space="12"/>
+        </w:pBdr>
+        <w:shd w:fill="F2F2F2" w:color="auto" w:val="clear"/>
+        <w:spacing w:after="40" w:line="300"/>
+      </w:pPr>
+      <w:r>
+        <w:rPr>
+          <w:rFonts w:ascii="Georgia" w:cs="Georgia" w:eastAsia="Georgia" w:hAnsi="Georgia"/>
+          <w:sz w:val="21"/>
+          <w:szCs w:val="21"/>
+        </w:rPr>
+        <w:t xml:space="preserve"/>
+      </w:r>
+    </w:p>
+    <w:p>
+      <w:pPr>
+        <w:pBdr>
+          <w:top w:val="single" w:color="BBBBBB" w:sz="2" w:space="10"/>
+          <w:bottom w:val="single" w:color="BBBBBB" w:sz="2" w:space="10"/>
+          <w:left w:val="single" w:color="BBBBBB" w:sz="2" w:space="12"/>
+          <w:right w:val="single" w:color="BBBBBB" w:sz="2" w:space="12"/>
+        </w:pBdr>
+        <w:shd w:fill="F2F2F2" w:color="auto" w:val="clear"/>
+        <w:spacing w:after="40" w:line="300"/>
+      </w:pPr>
+      <w:r>
+        <w:rPr>
+          <w:rFonts w:ascii="Georgia" w:cs="Georgia" w:eastAsia="Georgia" w:hAnsi="Georgia"/>
+          <w:sz w:val="21"/>
+          <w:szCs w:val="21"/>
+        </w:rPr>
+        <w:t xml:space="preserve"/>
+      </w:r>
+    </w:p>
+    <w:p>
+      <w:pPr>
+        <w:pBdr>
+          <w:top w:val="single" w:color="BBBBBB" w:sz="2" w:space="10"/>
+          <w:bottom w:val="single" w:color="BBBBBB" w:sz="2" w:space="10"/>
+          <w:left w:val="single" w:color="BBBBBB" w:sz="2" w:space="12"/>
+          <w:right w:val="single" w:color="BBBBBB" w:sz="2" w:space="12"/>
+        </w:pBdr>
+        <w:shd w:fill="F2F2F2" w:color="auto" w:val="clear"/>
+        <w:spacing w:after="160" w:line="300"/>
+      </w:pPr>
+      <w:r>
+        <w:rPr>
+          <w:rFonts w:ascii="Georgia" w:cs="Georgia" w:eastAsia="Georgia" w:hAnsi="Georgia"/>
+          <w:sz w:val="21"/>
+          <w:szCs w:val="21"/>
+        </w:rPr>
+        <w:t xml:space="preserve"/>
       </w:r>
     </w:p>
     <w:p>
@@ -3168,13 +3904,13 @@
     <w:p>
       <w:pPr>
         <w:pBdr>
-          <w:top w:val="single" w:color="BBBBBB" w:sz="2" w:space="6"/>
-          <w:bottom w:val="single" w:color="BBBBBB" w:sz="2" w:space="6"/>
-          <w:left w:val="single" w:color="BBBBBB" w:sz="2" w:space="6"/>
-          <w:right w:val="single" w:color="BBBBBB" w:sz="2" w:space="6"/>
-        </w:pBdr>
-        <w:shd w:fill="F2F2F2" w:color="auto" w:val="clear"/>
-        <w:spacing w:after="200" w:before="160" w:line="264"/>
+          <w:top w:val="single" w:color="BBBBBB" w:sz="2" w:space="10"/>
+          <w:bottom w:val="single" w:color="BBBBBB" w:sz="2" w:space="10"/>
+          <w:left w:val="single" w:color="BBBBBB" w:sz="2" w:space="12"/>
+          <w:right w:val="single" w:color="BBBBBB" w:sz="2" w:space="12"/>
+        </w:pBdr>
+        <w:shd w:fill="F2F2F2" w:color="auto" w:val="clear"/>
+        <w:spacing w:after="100" w:before="140" w:line="264"/>
       </w:pPr>
       <w:r>
         <w:rPr>
@@ -3186,8 +3922,20 @@
           <w:sz w:val="16"/>
           <w:szCs w:val="16"/>
         </w:rPr>
-        <w:t xml:space="preserve">LAB   </w:t>
-      </w:r>
+        <w:t xml:space="preserve">LAB</w:t>
+      </w:r>
+    </w:p>
+    <w:p>
+      <w:pPr>
+        <w:pBdr>
+          <w:top w:val="single" w:color="BBBBBB" w:sz="2" w:space="10"/>
+          <w:bottom w:val="single" w:color="BBBBBB" w:sz="2" w:space="10"/>
+          <w:left w:val="single" w:color="BBBBBB" w:sz="2" w:space="12"/>
+          <w:right w:val="single" w:color="BBBBBB" w:sz="2" w:space="12"/>
+        </w:pBdr>
+        <w:shd w:fill="F2F2F2" w:color="auto" w:val="clear"/>
+        <w:spacing w:after="120" w:line="300"/>
+      </w:pPr>
       <w:r>
         <w:rPr>
           <w:rFonts w:ascii="Georgia" w:cs="Georgia" w:eastAsia="Georgia" w:hAnsi="Georgia"/>
@@ -3196,6 +3944,86 @@
           <w:szCs w:val="21"/>
         </w:rPr>
         <w:t xml:space="preserve">TBD</w:t>
+      </w:r>
+    </w:p>
+    <w:p>
+      <w:pPr>
+        <w:pBdr>
+          <w:top w:val="single" w:color="BBBBBB" w:sz="2" w:space="10"/>
+          <w:bottom w:val="single" w:color="BBBBBB" w:sz="2" w:space="10"/>
+          <w:left w:val="single" w:color="BBBBBB" w:sz="2" w:space="12"/>
+          <w:right w:val="single" w:color="BBBBBB" w:sz="2" w:space="12"/>
+        </w:pBdr>
+        <w:shd w:fill="F2F2F2" w:color="auto" w:val="clear"/>
+        <w:spacing w:after="40" w:line="300"/>
+      </w:pPr>
+      <w:r>
+        <w:rPr>
+          <w:rFonts w:ascii="Georgia" w:cs="Georgia" w:eastAsia="Georgia" w:hAnsi="Georgia"/>
+          <w:sz w:val="21"/>
+          <w:szCs w:val="21"/>
+        </w:rPr>
+        <w:t xml:space="preserve"/>
+      </w:r>
+    </w:p>
+    <w:p>
+      <w:pPr>
+        <w:pBdr>
+          <w:top w:val="single" w:color="BBBBBB" w:sz="2" w:space="10"/>
+          <w:bottom w:val="single" w:color="BBBBBB" w:sz="2" w:space="10"/>
+          <w:left w:val="single" w:color="BBBBBB" w:sz="2" w:space="12"/>
+          <w:right w:val="single" w:color="BBBBBB" w:sz="2" w:space="12"/>
+        </w:pBdr>
+        <w:shd w:fill="F2F2F2" w:color="auto" w:val="clear"/>
+        <w:spacing w:after="40" w:line="300"/>
+      </w:pPr>
+      <w:r>
+        <w:rPr>
+          <w:rFonts w:ascii="Georgia" w:cs="Georgia" w:eastAsia="Georgia" w:hAnsi="Georgia"/>
+          <w:sz w:val="21"/>
+          <w:szCs w:val="21"/>
+        </w:rPr>
+        <w:t xml:space="preserve"/>
+      </w:r>
+    </w:p>
+    <w:p>
+      <w:pPr>
+        <w:pBdr>
+          <w:top w:val="single" w:color="BBBBBB" w:sz="2" w:space="10"/>
+          <w:bottom w:val="single" w:color="BBBBBB" w:sz="2" w:space="10"/>
+          <w:left w:val="single" w:color="BBBBBB" w:sz="2" w:space="12"/>
+          <w:right w:val="single" w:color="BBBBBB" w:sz="2" w:space="12"/>
+        </w:pBdr>
+        <w:shd w:fill="F2F2F2" w:color="auto" w:val="clear"/>
+        <w:spacing w:after="40" w:line="300"/>
+      </w:pPr>
+      <w:r>
+        <w:rPr>
+          <w:rFonts w:ascii="Georgia" w:cs="Georgia" w:eastAsia="Georgia" w:hAnsi="Georgia"/>
+          <w:sz w:val="21"/>
+          <w:szCs w:val="21"/>
+        </w:rPr>
+        <w:t xml:space="preserve"/>
+      </w:r>
+    </w:p>
+    <w:p>
+      <w:pPr>
+        <w:pBdr>
+          <w:top w:val="single" w:color="BBBBBB" w:sz="2" w:space="10"/>
+          <w:bottom w:val="single" w:color="BBBBBB" w:sz="2" w:space="10"/>
+          <w:left w:val="single" w:color="BBBBBB" w:sz="2" w:space="12"/>
+          <w:right w:val="single" w:color="BBBBBB" w:sz="2" w:space="12"/>
+        </w:pBdr>
+        <w:shd w:fill="F2F2F2" w:color="auto" w:val="clear"/>
+        <w:spacing w:after="160" w:line="300"/>
+      </w:pPr>
+      <w:r>
+        <w:rPr>
+          <w:rFonts w:ascii="Georgia" w:cs="Georgia" w:eastAsia="Georgia" w:hAnsi="Georgia"/>
+          <w:sz w:val="21"/>
+          <w:szCs w:val="21"/>
+        </w:rPr>
+        <w:t xml:space="preserve"/>
       </w:r>
     </w:p>
     <w:p>
@@ -3414,13 +4242,13 @@
     <w:p>
       <w:pPr>
         <w:pBdr>
-          <w:top w:val="single" w:color="BBBBBB" w:sz="2" w:space="6"/>
-          <w:bottom w:val="single" w:color="BBBBBB" w:sz="2" w:space="6"/>
-          <w:left w:val="single" w:color="BBBBBB" w:sz="2" w:space="6"/>
-          <w:right w:val="single" w:color="BBBBBB" w:sz="2" w:space="6"/>
-        </w:pBdr>
-        <w:shd w:fill="F2F2F2" w:color="auto" w:val="clear"/>
-        <w:spacing w:after="200" w:before="160" w:line="264"/>
+          <w:top w:val="single" w:color="BBBBBB" w:sz="2" w:space="10"/>
+          <w:bottom w:val="single" w:color="BBBBBB" w:sz="2" w:space="10"/>
+          <w:left w:val="single" w:color="BBBBBB" w:sz="2" w:space="12"/>
+          <w:right w:val="single" w:color="BBBBBB" w:sz="2" w:space="12"/>
+        </w:pBdr>
+        <w:shd w:fill="F2F2F2" w:color="auto" w:val="clear"/>
+        <w:spacing w:after="100" w:before="140" w:line="264"/>
       </w:pPr>
       <w:r>
         <w:rPr>
@@ -3432,8 +4260,20 @@
           <w:sz w:val="16"/>
           <w:szCs w:val="16"/>
         </w:rPr>
-        <w:t xml:space="preserve">LAB   </w:t>
-      </w:r>
+        <w:t xml:space="preserve">LAB</w:t>
+      </w:r>
+    </w:p>
+    <w:p>
+      <w:pPr>
+        <w:pBdr>
+          <w:top w:val="single" w:color="BBBBBB" w:sz="2" w:space="10"/>
+          <w:bottom w:val="single" w:color="BBBBBB" w:sz="2" w:space="10"/>
+          <w:left w:val="single" w:color="BBBBBB" w:sz="2" w:space="12"/>
+          <w:right w:val="single" w:color="BBBBBB" w:sz="2" w:space="12"/>
+        </w:pBdr>
+        <w:shd w:fill="F2F2F2" w:color="auto" w:val="clear"/>
+        <w:spacing w:after="120" w:line="300"/>
+      </w:pPr>
       <w:r>
         <w:rPr>
           <w:rFonts w:ascii="Georgia" w:cs="Georgia" w:eastAsia="Georgia" w:hAnsi="Georgia"/>
@@ -3442,6 +4282,86 @@
           <w:szCs w:val="21"/>
         </w:rPr>
         <w:t xml:space="preserve">TBD</w:t>
+      </w:r>
+    </w:p>
+    <w:p>
+      <w:pPr>
+        <w:pBdr>
+          <w:top w:val="single" w:color="BBBBBB" w:sz="2" w:space="10"/>
+          <w:bottom w:val="single" w:color="BBBBBB" w:sz="2" w:space="10"/>
+          <w:left w:val="single" w:color="BBBBBB" w:sz="2" w:space="12"/>
+          <w:right w:val="single" w:color="BBBBBB" w:sz="2" w:space="12"/>
+        </w:pBdr>
+        <w:shd w:fill="F2F2F2" w:color="auto" w:val="clear"/>
+        <w:spacing w:after="40" w:line="300"/>
+      </w:pPr>
+      <w:r>
+        <w:rPr>
+          <w:rFonts w:ascii="Georgia" w:cs="Georgia" w:eastAsia="Georgia" w:hAnsi="Georgia"/>
+          <w:sz w:val="21"/>
+          <w:szCs w:val="21"/>
+        </w:rPr>
+        <w:t xml:space="preserve"/>
+      </w:r>
+    </w:p>
+    <w:p>
+      <w:pPr>
+        <w:pBdr>
+          <w:top w:val="single" w:color="BBBBBB" w:sz="2" w:space="10"/>
+          <w:bottom w:val="single" w:color="BBBBBB" w:sz="2" w:space="10"/>
+          <w:left w:val="single" w:color="BBBBBB" w:sz="2" w:space="12"/>
+          <w:right w:val="single" w:color="BBBBBB" w:sz="2" w:space="12"/>
+        </w:pBdr>
+        <w:shd w:fill="F2F2F2" w:color="auto" w:val="clear"/>
+        <w:spacing w:after="40" w:line="300"/>
+      </w:pPr>
+      <w:r>
+        <w:rPr>
+          <w:rFonts w:ascii="Georgia" w:cs="Georgia" w:eastAsia="Georgia" w:hAnsi="Georgia"/>
+          <w:sz w:val="21"/>
+          <w:szCs w:val="21"/>
+        </w:rPr>
+        <w:t xml:space="preserve"/>
+      </w:r>
+    </w:p>
+    <w:p>
+      <w:pPr>
+        <w:pBdr>
+          <w:top w:val="single" w:color="BBBBBB" w:sz="2" w:space="10"/>
+          <w:bottom w:val="single" w:color="BBBBBB" w:sz="2" w:space="10"/>
+          <w:left w:val="single" w:color="BBBBBB" w:sz="2" w:space="12"/>
+          <w:right w:val="single" w:color="BBBBBB" w:sz="2" w:space="12"/>
+        </w:pBdr>
+        <w:shd w:fill="F2F2F2" w:color="auto" w:val="clear"/>
+        <w:spacing w:after="40" w:line="300"/>
+      </w:pPr>
+      <w:r>
+        <w:rPr>
+          <w:rFonts w:ascii="Georgia" w:cs="Georgia" w:eastAsia="Georgia" w:hAnsi="Georgia"/>
+          <w:sz w:val="21"/>
+          <w:szCs w:val="21"/>
+        </w:rPr>
+        <w:t xml:space="preserve"/>
+      </w:r>
+    </w:p>
+    <w:p>
+      <w:pPr>
+        <w:pBdr>
+          <w:top w:val="single" w:color="BBBBBB" w:sz="2" w:space="10"/>
+          <w:bottom w:val="single" w:color="BBBBBB" w:sz="2" w:space="10"/>
+          <w:left w:val="single" w:color="BBBBBB" w:sz="2" w:space="12"/>
+          <w:right w:val="single" w:color="BBBBBB" w:sz="2" w:space="12"/>
+        </w:pBdr>
+        <w:shd w:fill="F2F2F2" w:color="auto" w:val="clear"/>
+        <w:spacing w:after="160" w:line="300"/>
+      </w:pPr>
+      <w:r>
+        <w:rPr>
+          <w:rFonts w:ascii="Georgia" w:cs="Georgia" w:eastAsia="Georgia" w:hAnsi="Georgia"/>
+          <w:sz w:val="21"/>
+          <w:szCs w:val="21"/>
+        </w:rPr>
+        <w:t xml:space="preserve"/>
       </w:r>
     </w:p>
     <w:p>
@@ -3738,13 +4658,13 @@
     <w:p>
       <w:pPr>
         <w:pBdr>
-          <w:top w:val="single" w:color="BBBBBB" w:sz="2" w:space="6"/>
-          <w:bottom w:val="single" w:color="BBBBBB" w:sz="2" w:space="6"/>
-          <w:left w:val="single" w:color="BBBBBB" w:sz="2" w:space="6"/>
-          <w:right w:val="single" w:color="BBBBBB" w:sz="2" w:space="6"/>
-        </w:pBdr>
-        <w:shd w:fill="F2F2F2" w:color="auto" w:val="clear"/>
-        <w:spacing w:after="200" w:before="160" w:line="264"/>
+          <w:top w:val="single" w:color="BBBBBB" w:sz="2" w:space="10"/>
+          <w:bottom w:val="single" w:color="BBBBBB" w:sz="2" w:space="10"/>
+          <w:left w:val="single" w:color="BBBBBB" w:sz="2" w:space="12"/>
+          <w:right w:val="single" w:color="BBBBBB" w:sz="2" w:space="12"/>
+        </w:pBdr>
+        <w:shd w:fill="F2F2F2" w:color="auto" w:val="clear"/>
+        <w:spacing w:after="100" w:before="140" w:line="264"/>
       </w:pPr>
       <w:r>
         <w:rPr>
@@ -3756,8 +4676,20 @@
           <w:sz w:val="16"/>
           <w:szCs w:val="16"/>
         </w:rPr>
-        <w:t xml:space="preserve">LAB   </w:t>
-      </w:r>
+        <w:t xml:space="preserve">LAB</w:t>
+      </w:r>
+    </w:p>
+    <w:p>
+      <w:pPr>
+        <w:pBdr>
+          <w:top w:val="single" w:color="BBBBBB" w:sz="2" w:space="10"/>
+          <w:bottom w:val="single" w:color="BBBBBB" w:sz="2" w:space="10"/>
+          <w:left w:val="single" w:color="BBBBBB" w:sz="2" w:space="12"/>
+          <w:right w:val="single" w:color="BBBBBB" w:sz="2" w:space="12"/>
+        </w:pBdr>
+        <w:shd w:fill="F2F2F2" w:color="auto" w:val="clear"/>
+        <w:spacing w:after="120" w:line="300"/>
+      </w:pPr>
       <w:r>
         <w:rPr>
           <w:rFonts w:ascii="Georgia" w:cs="Georgia" w:eastAsia="Georgia" w:hAnsi="Georgia"/>
@@ -3766,6 +4698,86 @@
           <w:szCs w:val="21"/>
         </w:rPr>
         <w:t xml:space="preserve">TBD — your project / LOIC, HOIC, chaff. Present your project</w:t>
+      </w:r>
+    </w:p>
+    <w:p>
+      <w:pPr>
+        <w:pBdr>
+          <w:top w:val="single" w:color="BBBBBB" w:sz="2" w:space="10"/>
+          <w:bottom w:val="single" w:color="BBBBBB" w:sz="2" w:space="10"/>
+          <w:left w:val="single" w:color="BBBBBB" w:sz="2" w:space="12"/>
+          <w:right w:val="single" w:color="BBBBBB" w:sz="2" w:space="12"/>
+        </w:pBdr>
+        <w:shd w:fill="F2F2F2" w:color="auto" w:val="clear"/>
+        <w:spacing w:after="40" w:line="300"/>
+      </w:pPr>
+      <w:r>
+        <w:rPr>
+          <w:rFonts w:ascii="Georgia" w:cs="Georgia" w:eastAsia="Georgia" w:hAnsi="Georgia"/>
+          <w:sz w:val="21"/>
+          <w:szCs w:val="21"/>
+        </w:rPr>
+        <w:t xml:space="preserve"/>
+      </w:r>
+    </w:p>
+    <w:p>
+      <w:pPr>
+        <w:pBdr>
+          <w:top w:val="single" w:color="BBBBBB" w:sz="2" w:space="10"/>
+          <w:bottom w:val="single" w:color="BBBBBB" w:sz="2" w:space="10"/>
+          <w:left w:val="single" w:color="BBBBBB" w:sz="2" w:space="12"/>
+          <w:right w:val="single" w:color="BBBBBB" w:sz="2" w:space="12"/>
+        </w:pBdr>
+        <w:shd w:fill="F2F2F2" w:color="auto" w:val="clear"/>
+        <w:spacing w:after="40" w:line="300"/>
+      </w:pPr>
+      <w:r>
+        <w:rPr>
+          <w:rFonts w:ascii="Georgia" w:cs="Georgia" w:eastAsia="Georgia" w:hAnsi="Georgia"/>
+          <w:sz w:val="21"/>
+          <w:szCs w:val="21"/>
+        </w:rPr>
+        <w:t xml:space="preserve"/>
+      </w:r>
+    </w:p>
+    <w:p>
+      <w:pPr>
+        <w:pBdr>
+          <w:top w:val="single" w:color="BBBBBB" w:sz="2" w:space="10"/>
+          <w:bottom w:val="single" w:color="BBBBBB" w:sz="2" w:space="10"/>
+          <w:left w:val="single" w:color="BBBBBB" w:sz="2" w:space="12"/>
+          <w:right w:val="single" w:color="BBBBBB" w:sz="2" w:space="12"/>
+        </w:pBdr>
+        <w:shd w:fill="F2F2F2" w:color="auto" w:val="clear"/>
+        <w:spacing w:after="40" w:line="300"/>
+      </w:pPr>
+      <w:r>
+        <w:rPr>
+          <w:rFonts w:ascii="Georgia" w:cs="Georgia" w:eastAsia="Georgia" w:hAnsi="Georgia"/>
+          <w:sz w:val="21"/>
+          <w:szCs w:val="21"/>
+        </w:rPr>
+        <w:t xml:space="preserve"/>
+      </w:r>
+    </w:p>
+    <w:p>
+      <w:pPr>
+        <w:pBdr>
+          <w:top w:val="single" w:color="BBBBBB" w:sz="2" w:space="10"/>
+          <w:bottom w:val="single" w:color="BBBBBB" w:sz="2" w:space="10"/>
+          <w:left w:val="single" w:color="BBBBBB" w:sz="2" w:space="12"/>
+          <w:right w:val="single" w:color="BBBBBB" w:sz="2" w:space="12"/>
+        </w:pBdr>
+        <w:shd w:fill="F2F2F2" w:color="auto" w:val="clear"/>
+        <w:spacing w:after="160" w:line="300"/>
+      </w:pPr>
+      <w:r>
+        <w:rPr>
+          <w:rFonts w:ascii="Georgia" w:cs="Georgia" w:eastAsia="Georgia" w:hAnsi="Georgia"/>
+          <w:sz w:val="21"/>
+          <w:szCs w:val="21"/>
+        </w:rPr>
+        <w:t xml:space="preserve"/>
       </w:r>
     </w:p>
     <w:p>
@@ -4088,13 +5100,13 @@
     <w:p>
       <w:pPr>
         <w:pBdr>
-          <w:top w:val="single" w:color="BBBBBB" w:sz="2" w:space="6"/>
-          <w:bottom w:val="single" w:color="BBBBBB" w:sz="2" w:space="6"/>
-          <w:left w:val="single" w:color="BBBBBB" w:sz="2" w:space="6"/>
-          <w:right w:val="single" w:color="BBBBBB" w:sz="2" w:space="6"/>
-        </w:pBdr>
-        <w:shd w:fill="F2F2F2" w:color="auto" w:val="clear"/>
-        <w:spacing w:after="200" w:before="160" w:line="264"/>
+          <w:top w:val="single" w:color="BBBBBB" w:sz="2" w:space="10"/>
+          <w:bottom w:val="single" w:color="BBBBBB" w:sz="2" w:space="10"/>
+          <w:left w:val="single" w:color="BBBBBB" w:sz="2" w:space="12"/>
+          <w:right w:val="single" w:color="BBBBBB" w:sz="2" w:space="12"/>
+        </w:pBdr>
+        <w:shd w:fill="F2F2F2" w:color="auto" w:val="clear"/>
+        <w:spacing w:after="100" w:before="140" w:line="264"/>
       </w:pPr>
       <w:r>
         <w:rPr>
@@ -4106,8 +5118,20 @@
           <w:sz w:val="16"/>
           <w:szCs w:val="16"/>
         </w:rPr>
-        <w:t xml:space="preserve">LAB   </w:t>
-      </w:r>
+        <w:t xml:space="preserve">LAB</w:t>
+      </w:r>
+    </w:p>
+    <w:p>
+      <w:pPr>
+        <w:pBdr>
+          <w:top w:val="single" w:color="BBBBBB" w:sz="2" w:space="10"/>
+          <w:bottom w:val="single" w:color="BBBBBB" w:sz="2" w:space="10"/>
+          <w:left w:val="single" w:color="BBBBBB" w:sz="2" w:space="12"/>
+          <w:right w:val="single" w:color="BBBBBB" w:sz="2" w:space="12"/>
+        </w:pBdr>
+        <w:shd w:fill="F2F2F2" w:color="auto" w:val="clear"/>
+        <w:spacing w:after="120" w:line="300"/>
+      </w:pPr>
       <w:r>
         <w:rPr>
           <w:rFonts w:ascii="Georgia" w:cs="Georgia" w:eastAsia="Georgia" w:hAnsi="Georgia"/>
@@ -4116,6 +5140,86 @@
           <w:szCs w:val="21"/>
         </w:rPr>
         <w:t xml:space="preserve">Present your project</w:t>
+      </w:r>
+    </w:p>
+    <w:p>
+      <w:pPr>
+        <w:pBdr>
+          <w:top w:val="single" w:color="BBBBBB" w:sz="2" w:space="10"/>
+          <w:bottom w:val="single" w:color="BBBBBB" w:sz="2" w:space="10"/>
+          <w:left w:val="single" w:color="BBBBBB" w:sz="2" w:space="12"/>
+          <w:right w:val="single" w:color="BBBBBB" w:sz="2" w:space="12"/>
+        </w:pBdr>
+        <w:shd w:fill="F2F2F2" w:color="auto" w:val="clear"/>
+        <w:spacing w:after="40" w:line="300"/>
+      </w:pPr>
+      <w:r>
+        <w:rPr>
+          <w:rFonts w:ascii="Georgia" w:cs="Georgia" w:eastAsia="Georgia" w:hAnsi="Georgia"/>
+          <w:sz w:val="21"/>
+          <w:szCs w:val="21"/>
+        </w:rPr>
+        <w:t xml:space="preserve"/>
+      </w:r>
+    </w:p>
+    <w:p>
+      <w:pPr>
+        <w:pBdr>
+          <w:top w:val="single" w:color="BBBBBB" w:sz="2" w:space="10"/>
+          <w:bottom w:val="single" w:color="BBBBBB" w:sz="2" w:space="10"/>
+          <w:left w:val="single" w:color="BBBBBB" w:sz="2" w:space="12"/>
+          <w:right w:val="single" w:color="BBBBBB" w:sz="2" w:space="12"/>
+        </w:pBdr>
+        <w:shd w:fill="F2F2F2" w:color="auto" w:val="clear"/>
+        <w:spacing w:after="40" w:line="300"/>
+      </w:pPr>
+      <w:r>
+        <w:rPr>
+          <w:rFonts w:ascii="Georgia" w:cs="Georgia" w:eastAsia="Georgia" w:hAnsi="Georgia"/>
+          <w:sz w:val="21"/>
+          <w:szCs w:val="21"/>
+        </w:rPr>
+        <w:t xml:space="preserve"/>
+      </w:r>
+    </w:p>
+    <w:p>
+      <w:pPr>
+        <w:pBdr>
+          <w:top w:val="single" w:color="BBBBBB" w:sz="2" w:space="10"/>
+          <w:bottom w:val="single" w:color="BBBBBB" w:sz="2" w:space="10"/>
+          <w:left w:val="single" w:color="BBBBBB" w:sz="2" w:space="12"/>
+          <w:right w:val="single" w:color="BBBBBB" w:sz="2" w:space="12"/>
+        </w:pBdr>
+        <w:shd w:fill="F2F2F2" w:color="auto" w:val="clear"/>
+        <w:spacing w:after="40" w:line="300"/>
+      </w:pPr>
+      <w:r>
+        <w:rPr>
+          <w:rFonts w:ascii="Georgia" w:cs="Georgia" w:eastAsia="Georgia" w:hAnsi="Georgia"/>
+          <w:sz w:val="21"/>
+          <w:szCs w:val="21"/>
+        </w:rPr>
+        <w:t xml:space="preserve"/>
+      </w:r>
+    </w:p>
+    <w:p>
+      <w:pPr>
+        <w:pBdr>
+          <w:top w:val="single" w:color="BBBBBB" w:sz="2" w:space="10"/>
+          <w:bottom w:val="single" w:color="BBBBBB" w:sz="2" w:space="10"/>
+          <w:left w:val="single" w:color="BBBBBB" w:sz="2" w:space="12"/>
+          <w:right w:val="single" w:color="BBBBBB" w:sz="2" w:space="12"/>
+        </w:pBdr>
+        <w:shd w:fill="F2F2F2" w:color="auto" w:val="clear"/>
+        <w:spacing w:after="160" w:line="300"/>
+      </w:pPr>
+      <w:r>
+        <w:rPr>
+          <w:rFonts w:ascii="Georgia" w:cs="Georgia" w:eastAsia="Georgia" w:hAnsi="Georgia"/>
+          <w:sz w:val="21"/>
+          <w:szCs w:val="21"/>
+        </w:rPr>
+        <w:t xml:space="preserve"/>
       </w:r>
     </w:p>
     <w:sectPr>

</xml_diff>